<commit_message>
update: colaboratori extinsi + redenumire Anexa 2 + POLARIS Bears
- Colaboratori: BARNA (1), MONTANARI (2), ZELENSCHI (3) — ordine si descrieri complete
  ZELENSCHI: ing. chimic UCL/Melbourne, PhD(c) AI, Raiffeisen AI, NASA Ames, Space Settlement Premiul II
  MONTANARI: Doctorand Dinamica Fasciculelor CERN, consultanta LHC → POLARIS
  BARNA: Fizica LASER-ilor (corectie capitalizare si cratima)
- Nume echipa unificat: POLARIS Bears (nu Polaris Bears)
- 03_Date_Identificare.docx → 03_Anexa_2_Date_Identificare.docx
- Coperta: studenti pe un rand + scoala completata; Aaron → AARON
- doc3: categoria Juniori, telefon mentor, unitati scolare completate
- Typo fix: Inscricere → Inscriere; prescrurtari → prescurtari

Co-Authored-By: Claude Sonnet 4.6 <noreply@anthropic.com>
</commit_message>
<xml_diff>
--- a/output/01_Coperta.docx
+++ b/output/01_Coperta.docx
@@ -163,7 +163,7 @@
           <w:i w:val="0"/>
           <w:sz w:val="26"/>
         </w:rPr>
-        <w:t>Echipă: Polaris Bears</w:t>
+        <w:t>Echipă: POLARIS Bears</w:t>
       </w:r>
     </w:p>
     <w:p>
@@ -178,7 +178,7 @@
           <w:i w:val="0"/>
           <w:sz w:val="22"/>
         </w:rPr>
-        <w:t>Ioan Cristian CHELARU — clasa a VIII-a  [unitate şcolară: de completat]</w:t>
+        <w:t>Ioan Cristian CHELARU | Albert David OLARIU</w:t>
       </w:r>
     </w:p>
     <w:p>
@@ -191,9 +191,9 @@
           <w:rFonts w:ascii="Calibri" w:hAnsi="Calibri"/>
           <w:b w:val="0"/>
           <w:i w:val="0"/>
-          <w:sz w:val="22"/>
+          <w:sz w:val="20"/>
         </w:rPr>
-        <w:t>Albert David OLARIU — clasa a VIII-a  [unitate şcolară: de completat]</w:t>
+        <w:t>clasa a VIII-a, ICHB — Liceul Teoretic Internațional de Informatică Bucureşti</w:t>
       </w:r>
     </w:p>
     <w:p>
@@ -208,7 +208,7 @@
           <w:i w:val="0"/>
           <w:sz w:val="22"/>
         </w:rPr>
-        <w:t>Mentor: Prof. Francisc Dionisie Aaron</w:t>
+        <w:t>Mentor: Prof. Francisc Dionisie AARON</w:t>
       </w:r>
     </w:p>
     <w:p>
@@ -253,7 +253,7 @@
           <w:i w:val="0"/>
           <w:sz w:val="20"/>
         </w:rPr>
-        <w:t>Carlo Emilio MONTANARI — Fizician aplicat, Doctorand CERN / Univ. Bologna</w:t>
+        <w:t>Prof. Univ. Dr. Valentin BARNA — Facultatea de Fizică, Univ. Bucureşti</w:t>
       </w:r>
     </w:p>
     <w:p>
@@ -268,7 +268,7 @@
           <w:i w:val="0"/>
           <w:sz w:val="20"/>
         </w:rPr>
-        <w:t>Daniel-Justinian ZELENSCHI — NASA Ames Research Center</w:t>
+        <w:t>Carlo Emilio MONTANARI — Fizician aplicat, Doctorand CERN / Univ. Bologna</w:t>
       </w:r>
     </w:p>
     <w:p>
@@ -283,7 +283,7 @@
           <w:i w:val="0"/>
           <w:sz w:val="20"/>
         </w:rPr>
-        <w:t>Prof. Univ. Dr. Valentin BARNA — Facultatea de Fizică, Univ. Bucureşti</w:t>
+        <w:t>Daniel-Justinian ZELENSCHI — NASA Ames Research Center</w:t>
       </w:r>
     </w:p>
     <w:p>
@@ -314,7 +314,7 @@
           <w:i/>
           <w:sz w:val="18"/>
         </w:rPr>
-        <w:t>⚠  Câmpuri de completat înainte de depunere: unitatea şcolară a fiecărui elev, numărul de telefon al mentorului, categoria ONCS 2026.</w:t>
+        <w:t>Toate datele de identificare sunt completate. Verificati diacriticele si formatarea inainte de depunerea dosarului.</w:t>
       </w:r>
     </w:p>
     <w:sectPr>

</xml_diff>